<commit_message>
docs: correcciones de la revisión independiente
Alcance real de las pruebas ESC-04 y del chequeo 5, PR #1 a #6 sin revisión, exposición de SSH por confirmar, PR #8 (reglas de sobre), cuenta compartida soarai2026, alcance del hook de gitleaks, diagramas corregidos y contexto maestro 2.1 versionado en docs/00-indice.
</commit_message>
<xml_diff>
--- a/docs/entregables/00_indice.docx
+++ b/docs/entregables/00_indice.docx
@@ -1408,7 +1408,7 @@
         </w:r>
         <w:r>
           <w:rPr/>
-          <w:t xml:space="preserve">8</w:t>
+          <w:t xml:space="preserve">9</w:t>
         </w:r>
       </w:hyperlink>
       <w:r>
@@ -1698,11 +1698,13 @@
         <w:tblLayout w:type="fixed"/>
       </w:tblPr>
       <w:tblGrid>
-        <w:gridCol w:w="596"/>
-        <w:gridCol w:w="3047"/>
-        <w:gridCol w:w="2782"/>
-        <w:gridCol w:w="2186"/>
-        <w:gridCol w:w="794"/>
+        <w:gridCol w:w="479"/>
+        <w:gridCol w:w="2636"/>
+        <w:gridCol w:w="2336"/>
+        <w:gridCol w:w="1677"/>
+        <w:gridCol w:w="599"/>
+        <w:gridCol w:w="778"/>
+        <w:gridCol w:w="898"/>
       </w:tblGrid>
       <w:tr>
         <w:trPr>
@@ -1711,7 +1713,7 @@
         </w:trPr>
         <w:tc>
           <w:tcPr>
-            <w:tcW w:type="dxa" w:w="596"/>
+            <w:tcW w:type="dxa" w:w="479"/>
             <w:vAlign w:val="center"/>
             <w:shd w:val="clear" w:color="auto" w:fill="1F3A5F"/>
           </w:tcPr>
@@ -1731,7 +1733,7 @@
         </w:tc>
         <w:tc>
           <w:tcPr>
-            <w:tcW w:type="dxa" w:w="3047"/>
+            <w:tcW w:type="dxa" w:w="2636"/>
             <w:vAlign w:val="center"/>
             <w:shd w:val="clear" w:color="auto" w:fill="1F3A5F"/>
           </w:tcPr>
@@ -1751,7 +1753,7 @@
         </w:tc>
         <w:tc>
           <w:tcPr>
-            <w:tcW w:type="dxa" w:w="2782"/>
+            <w:tcW w:type="dxa" w:w="2336"/>
             <w:vAlign w:val="center"/>
             <w:shd w:val="clear" w:color="auto" w:fill="1F3A5F"/>
           </w:tcPr>
@@ -1771,7 +1773,7 @@
         </w:tc>
         <w:tc>
           <w:tcPr>
-            <w:tcW w:type="dxa" w:w="2186"/>
+            <w:tcW w:type="dxa" w:w="1677"/>
             <w:vAlign w:val="center"/>
             <w:shd w:val="clear" w:color="auto" w:fill="1F3A5F"/>
           </w:tcPr>
@@ -1791,7 +1793,7 @@
         </w:tc>
         <w:tc>
           <w:tcPr>
-            <w:tcW w:type="dxa" w:w="795"/>
+            <w:tcW w:type="dxa" w:w="599"/>
             <w:vAlign w:val="center"/>
             <w:shd w:val="clear" w:color="auto" w:fill="1F3A5F"/>
           </w:tcPr>
@@ -1806,6 +1808,46 @@
                 <w:sz w:val="19"/>
               </w:rPr>
               <w:t>Prio.</w:t>
+            </w:r>
+          </w:p>
+        </w:tc>
+        <w:tc>
+          <w:tcPr>
+            <w:tcW w:type="dxa" w:w="779"/>
+            <w:vAlign w:val="center"/>
+            <w:shd w:val="clear" w:color="auto" w:fill="1F3A5F"/>
+          </w:tcPr>
+          <w:p>
+            <w:pPr>
+              <w:pStyle w:val="Textodetabla"/>
+            </w:pPr>
+            <w:r>
+              <w:rPr>
+                <w:b/>
+                <w:color w:val="FFFFFF"/>
+                <w:sz w:val="19"/>
+              </w:rPr>
+              <w:t>Versión</w:t>
+            </w:r>
+          </w:p>
+        </w:tc>
+        <w:tc>
+          <w:tcPr>
+            <w:tcW w:type="dxa" w:w="899"/>
+            <w:vAlign w:val="center"/>
+            <w:shd w:val="clear" w:color="auto" w:fill="1F3A5F"/>
+          </w:tcPr>
+          <w:p>
+            <w:pPr>
+              <w:pStyle w:val="Textodetabla"/>
+            </w:pPr>
+            <w:r>
+              <w:rPr>
+                <w:b/>
+                <w:color w:val="FFFFFF"/>
+                <w:sz w:val="19"/>
+              </w:rPr>
+              <w:t>Estado</w:t>
             </w:r>
           </w:p>
         </w:tc>
@@ -1816,7 +1858,7 @@
         </w:trPr>
         <w:tc>
           <w:tcPr>
-            <w:tcW w:type="dxa" w:w="596"/>
+            <w:tcW w:type="dxa" w:w="479"/>
             <w:vAlign w:val="top"/>
           </w:tcPr>
           <w:p>
@@ -1833,7 +1875,7 @@
         </w:tc>
         <w:tc>
           <w:tcPr>
-            <w:tcW w:type="dxa" w:w="3047"/>
+            <w:tcW w:type="dxa" w:w="2636"/>
             <w:vAlign w:val="top"/>
           </w:tcPr>
           <w:p>
@@ -1850,7 +1892,7 @@
         </w:tc>
         <w:tc>
           <w:tcPr>
-            <w:tcW w:type="dxa" w:w="2782"/>
+            <w:tcW w:type="dxa" w:w="2336"/>
             <w:vAlign w:val="top"/>
           </w:tcPr>
           <w:p>
@@ -1869,7 +1911,7 @@
         </w:tc>
         <w:tc>
           <w:tcPr>
-            <w:tcW w:type="dxa" w:w="2186"/>
+            <w:tcW w:type="dxa" w:w="1677"/>
             <w:vAlign w:val="top"/>
           </w:tcPr>
           <w:p>
@@ -1886,7 +1928,7 @@
         </w:tc>
         <w:tc>
           <w:tcPr>
-            <w:tcW w:type="dxa" w:w="795"/>
+            <w:tcW w:type="dxa" w:w="599"/>
             <w:vAlign w:val="top"/>
           </w:tcPr>
           <w:p>
@@ -1898,6 +1940,40 @@
                 <w:sz w:val="19"/>
               </w:rPr>
               <w:t>P1</w:t>
+            </w:r>
+          </w:p>
+        </w:tc>
+        <w:tc>
+          <w:tcPr>
+            <w:tcW w:type="dxa" w:w="779"/>
+            <w:vAlign w:val="top"/>
+          </w:tcPr>
+          <w:p>
+            <w:pPr>
+              <w:pStyle w:val="Textodetabla"/>
+            </w:pPr>
+            <w:r>
+              <w:rPr>
+                <w:sz w:val="19"/>
+              </w:rPr>
+              <w:t>0.1</w:t>
+            </w:r>
+          </w:p>
+        </w:tc>
+        <w:tc>
+          <w:tcPr>
+            <w:tcW w:type="dxa" w:w="899"/>
+            <w:vAlign w:val="top"/>
+          </w:tcPr>
+          <w:p>
+            <w:pPr>
+              <w:pStyle w:val="Textodetabla"/>
+            </w:pPr>
+            <w:r>
+              <w:rPr>
+                <w:sz w:val="19"/>
+              </w:rPr>
+              <w:t>Borrador</w:t>
             </w:r>
           </w:p>
         </w:tc>
@@ -1908,7 +1984,7 @@
         </w:trPr>
         <w:tc>
           <w:tcPr>
-            <w:tcW w:type="dxa" w:w="596"/>
+            <w:tcW w:type="dxa" w:w="479"/>
             <w:vAlign w:val="top"/>
             <w:shd w:val="clear" w:color="auto" w:fill="F3F6FA"/>
           </w:tcPr>
@@ -1926,7 +2002,7 @@
         </w:tc>
         <w:tc>
           <w:tcPr>
-            <w:tcW w:type="dxa" w:w="3047"/>
+            <w:tcW w:type="dxa" w:w="2636"/>
             <w:vAlign w:val="top"/>
             <w:shd w:val="clear" w:color="auto" w:fill="F3F6FA"/>
           </w:tcPr>
@@ -1944,7 +2020,7 @@
         </w:tc>
         <w:tc>
           <w:tcPr>
-            <w:tcW w:type="dxa" w:w="2782"/>
+            <w:tcW w:type="dxa" w:w="2336"/>
             <w:vAlign w:val="top"/>
             <w:shd w:val="clear" w:color="auto" w:fill="F3F6FA"/>
           </w:tcPr>
@@ -1964,7 +2040,7 @@
         </w:tc>
         <w:tc>
           <w:tcPr>
-            <w:tcW w:type="dxa" w:w="2186"/>
+            <w:tcW w:type="dxa" w:w="1677"/>
             <w:vAlign w:val="top"/>
             <w:shd w:val="clear" w:color="auto" w:fill="F3F6FA"/>
           </w:tcPr>
@@ -1982,7 +2058,7 @@
         </w:tc>
         <w:tc>
           <w:tcPr>
-            <w:tcW w:type="dxa" w:w="795"/>
+            <w:tcW w:type="dxa" w:w="599"/>
             <w:vAlign w:val="top"/>
             <w:shd w:val="clear" w:color="auto" w:fill="F3F6FA"/>
           </w:tcPr>
@@ -1995,6 +2071,42 @@
                 <w:sz w:val="19"/>
               </w:rPr>
               <w:t>P1</w:t>
+            </w:r>
+          </w:p>
+        </w:tc>
+        <w:tc>
+          <w:tcPr>
+            <w:tcW w:type="dxa" w:w="779"/>
+            <w:vAlign w:val="top"/>
+            <w:shd w:val="clear" w:color="auto" w:fill="F3F6FA"/>
+          </w:tcPr>
+          <w:p>
+            <w:pPr>
+              <w:pStyle w:val="Textodetabla"/>
+            </w:pPr>
+            <w:r>
+              <w:rPr>
+                <w:sz w:val="19"/>
+              </w:rPr>
+              <w:t>0.1</w:t>
+            </w:r>
+          </w:p>
+        </w:tc>
+        <w:tc>
+          <w:tcPr>
+            <w:tcW w:type="dxa" w:w="899"/>
+            <w:vAlign w:val="top"/>
+            <w:shd w:val="clear" w:color="auto" w:fill="F3F6FA"/>
+          </w:tcPr>
+          <w:p>
+            <w:pPr>
+              <w:pStyle w:val="Textodetabla"/>
+            </w:pPr>
+            <w:r>
+              <w:rPr>
+                <w:sz w:val="19"/>
+              </w:rPr>
+              <w:t>Borrador</w:t>
             </w:r>
           </w:p>
         </w:tc>
@@ -2005,7 +2117,7 @@
         </w:trPr>
         <w:tc>
           <w:tcPr>
-            <w:tcW w:type="dxa" w:w="596"/>
+            <w:tcW w:type="dxa" w:w="479"/>
             <w:vAlign w:val="top"/>
           </w:tcPr>
           <w:p>
@@ -2022,7 +2134,7 @@
         </w:tc>
         <w:tc>
           <w:tcPr>
-            <w:tcW w:type="dxa" w:w="3047"/>
+            <w:tcW w:type="dxa" w:w="2636"/>
             <w:vAlign w:val="top"/>
           </w:tcPr>
           <w:p>
@@ -2039,7 +2151,7 @@
         </w:tc>
         <w:tc>
           <w:tcPr>
-            <w:tcW w:type="dxa" w:w="2782"/>
+            <w:tcW w:type="dxa" w:w="2336"/>
             <w:vAlign w:val="top"/>
           </w:tcPr>
           <w:p>
@@ -2058,7 +2170,7 @@
         </w:tc>
         <w:tc>
           <w:tcPr>
-            <w:tcW w:type="dxa" w:w="2186"/>
+            <w:tcW w:type="dxa" w:w="1677"/>
             <w:vAlign w:val="top"/>
           </w:tcPr>
           <w:p>
@@ -2075,7 +2187,7 @@
         </w:tc>
         <w:tc>
           <w:tcPr>
-            <w:tcW w:type="dxa" w:w="795"/>
+            <w:tcW w:type="dxa" w:w="599"/>
             <w:vAlign w:val="top"/>
           </w:tcPr>
           <w:p>
@@ -2087,6 +2199,40 @@
                 <w:sz w:val="19"/>
               </w:rPr>
               <w:t>P1</w:t>
+            </w:r>
+          </w:p>
+        </w:tc>
+        <w:tc>
+          <w:tcPr>
+            <w:tcW w:type="dxa" w:w="779"/>
+            <w:vAlign w:val="top"/>
+          </w:tcPr>
+          <w:p>
+            <w:pPr>
+              <w:pStyle w:val="Textodetabla"/>
+            </w:pPr>
+            <w:r>
+              <w:rPr>
+                <w:sz w:val="19"/>
+              </w:rPr>
+              <w:t>0.1</w:t>
+            </w:r>
+          </w:p>
+        </w:tc>
+        <w:tc>
+          <w:tcPr>
+            <w:tcW w:type="dxa" w:w="899"/>
+            <w:vAlign w:val="top"/>
+          </w:tcPr>
+          <w:p>
+            <w:pPr>
+              <w:pStyle w:val="Textodetabla"/>
+            </w:pPr>
+            <w:r>
+              <w:rPr>
+                <w:sz w:val="19"/>
+              </w:rPr>
+              <w:t>Borrador</w:t>
             </w:r>
           </w:p>
         </w:tc>
@@ -2097,7 +2243,7 @@
         </w:trPr>
         <w:tc>
           <w:tcPr>
-            <w:tcW w:type="dxa" w:w="596"/>
+            <w:tcW w:type="dxa" w:w="479"/>
             <w:vAlign w:val="top"/>
             <w:shd w:val="clear" w:color="auto" w:fill="F3F6FA"/>
           </w:tcPr>
@@ -2115,7 +2261,7 @@
         </w:tc>
         <w:tc>
           <w:tcPr>
-            <w:tcW w:type="dxa" w:w="3047"/>
+            <w:tcW w:type="dxa" w:w="2636"/>
             <w:vAlign w:val="top"/>
             <w:shd w:val="clear" w:color="auto" w:fill="F3F6FA"/>
           </w:tcPr>
@@ -2133,7 +2279,7 @@
         </w:tc>
         <w:tc>
           <w:tcPr>
-            <w:tcW w:type="dxa" w:w="2782"/>
+            <w:tcW w:type="dxa" w:w="2336"/>
             <w:vAlign w:val="top"/>
             <w:shd w:val="clear" w:color="auto" w:fill="F3F6FA"/>
           </w:tcPr>
@@ -2153,7 +2299,7 @@
         </w:tc>
         <w:tc>
           <w:tcPr>
-            <w:tcW w:type="dxa" w:w="2186"/>
+            <w:tcW w:type="dxa" w:w="1677"/>
             <w:vAlign w:val="top"/>
             <w:shd w:val="clear" w:color="auto" w:fill="F3F6FA"/>
           </w:tcPr>
@@ -2171,7 +2317,7 @@
         </w:tc>
         <w:tc>
           <w:tcPr>
-            <w:tcW w:type="dxa" w:w="795"/>
+            <w:tcW w:type="dxa" w:w="599"/>
             <w:vAlign w:val="top"/>
             <w:shd w:val="clear" w:color="auto" w:fill="F3F6FA"/>
           </w:tcPr>
@@ -2184,6 +2330,42 @@
                 <w:sz w:val="19"/>
               </w:rPr>
               <w:t>P2</w:t>
+            </w:r>
+          </w:p>
+        </w:tc>
+        <w:tc>
+          <w:tcPr>
+            <w:tcW w:type="dxa" w:w="779"/>
+            <w:vAlign w:val="top"/>
+            <w:shd w:val="clear" w:color="auto" w:fill="F3F6FA"/>
+          </w:tcPr>
+          <w:p>
+            <w:pPr>
+              <w:pStyle w:val="Textodetabla"/>
+            </w:pPr>
+            <w:r>
+              <w:rPr>
+                <w:sz w:val="19"/>
+              </w:rPr>
+              <w:t>0.1</w:t>
+            </w:r>
+          </w:p>
+        </w:tc>
+        <w:tc>
+          <w:tcPr>
+            <w:tcW w:type="dxa" w:w="899"/>
+            <w:vAlign w:val="top"/>
+            <w:shd w:val="clear" w:color="auto" w:fill="F3F6FA"/>
+          </w:tcPr>
+          <w:p>
+            <w:pPr>
+              <w:pStyle w:val="Textodetabla"/>
+            </w:pPr>
+            <w:r>
+              <w:rPr>
+                <w:sz w:val="19"/>
+              </w:rPr>
+              <w:t>Borrador</w:t>
             </w:r>
           </w:p>
         </w:tc>
@@ -2194,7 +2376,7 @@
         </w:trPr>
         <w:tc>
           <w:tcPr>
-            <w:tcW w:type="dxa" w:w="596"/>
+            <w:tcW w:type="dxa" w:w="479"/>
             <w:vAlign w:val="top"/>
           </w:tcPr>
           <w:p>
@@ -2211,7 +2393,7 @@
         </w:tc>
         <w:tc>
           <w:tcPr>
-            <w:tcW w:type="dxa" w:w="3047"/>
+            <w:tcW w:type="dxa" w:w="2636"/>
             <w:vAlign w:val="top"/>
           </w:tcPr>
           <w:p>
@@ -2228,7 +2410,7 @@
         </w:tc>
         <w:tc>
           <w:tcPr>
-            <w:tcW w:type="dxa" w:w="2782"/>
+            <w:tcW w:type="dxa" w:w="2336"/>
             <w:vAlign w:val="top"/>
           </w:tcPr>
           <w:p>
@@ -2247,7 +2429,7 @@
         </w:tc>
         <w:tc>
           <w:tcPr>
-            <w:tcW w:type="dxa" w:w="2186"/>
+            <w:tcW w:type="dxa" w:w="1677"/>
             <w:vAlign w:val="top"/>
           </w:tcPr>
           <w:p>
@@ -2264,7 +2446,7 @@
         </w:tc>
         <w:tc>
           <w:tcPr>
-            <w:tcW w:type="dxa" w:w="795"/>
+            <w:tcW w:type="dxa" w:w="599"/>
             <w:vAlign w:val="top"/>
           </w:tcPr>
           <w:p>
@@ -2276,6 +2458,40 @@
                 <w:sz w:val="19"/>
               </w:rPr>
               <w:t>P2</w:t>
+            </w:r>
+          </w:p>
+        </w:tc>
+        <w:tc>
+          <w:tcPr>
+            <w:tcW w:type="dxa" w:w="779"/>
+            <w:vAlign w:val="top"/>
+          </w:tcPr>
+          <w:p>
+            <w:pPr>
+              <w:pStyle w:val="Textodetabla"/>
+            </w:pPr>
+            <w:r>
+              <w:rPr>
+                <w:sz w:val="19"/>
+              </w:rPr>
+              <w:t>0.1</w:t>
+            </w:r>
+          </w:p>
+        </w:tc>
+        <w:tc>
+          <w:tcPr>
+            <w:tcW w:type="dxa" w:w="899"/>
+            <w:vAlign w:val="top"/>
+          </w:tcPr>
+          <w:p>
+            <w:pPr>
+              <w:pStyle w:val="Textodetabla"/>
+            </w:pPr>
+            <w:r>
+              <w:rPr>
+                <w:sz w:val="19"/>
+              </w:rPr>
+              <w:t>Borrador</w:t>
             </w:r>
           </w:p>
         </w:tc>
@@ -2286,7 +2502,7 @@
         </w:trPr>
         <w:tc>
           <w:tcPr>
-            <w:tcW w:type="dxa" w:w="596"/>
+            <w:tcW w:type="dxa" w:w="479"/>
             <w:vAlign w:val="top"/>
             <w:shd w:val="clear" w:color="auto" w:fill="F3F6FA"/>
           </w:tcPr>
@@ -2304,7 +2520,7 @@
         </w:tc>
         <w:tc>
           <w:tcPr>
-            <w:tcW w:type="dxa" w:w="3047"/>
+            <w:tcW w:type="dxa" w:w="2636"/>
             <w:vAlign w:val="top"/>
             <w:shd w:val="clear" w:color="auto" w:fill="F3F6FA"/>
           </w:tcPr>
@@ -2322,7 +2538,7 @@
         </w:tc>
         <w:tc>
           <w:tcPr>
-            <w:tcW w:type="dxa" w:w="2782"/>
+            <w:tcW w:type="dxa" w:w="2336"/>
             <w:vAlign w:val="top"/>
             <w:shd w:val="clear" w:color="auto" w:fill="F3F6FA"/>
           </w:tcPr>
@@ -2342,7 +2558,7 @@
         </w:tc>
         <w:tc>
           <w:tcPr>
-            <w:tcW w:type="dxa" w:w="2186"/>
+            <w:tcW w:type="dxa" w:w="1677"/>
             <w:vAlign w:val="top"/>
             <w:shd w:val="clear" w:color="auto" w:fill="F3F6FA"/>
           </w:tcPr>
@@ -2360,7 +2576,7 @@
         </w:tc>
         <w:tc>
           <w:tcPr>
-            <w:tcW w:type="dxa" w:w="795"/>
+            <w:tcW w:type="dxa" w:w="599"/>
             <w:vAlign w:val="top"/>
             <w:shd w:val="clear" w:color="auto" w:fill="F3F6FA"/>
           </w:tcPr>
@@ -2373,6 +2589,42 @@
                 <w:sz w:val="19"/>
               </w:rPr>
               <w:t>P2</w:t>
+            </w:r>
+          </w:p>
+        </w:tc>
+        <w:tc>
+          <w:tcPr>
+            <w:tcW w:type="dxa" w:w="779"/>
+            <w:vAlign w:val="top"/>
+            <w:shd w:val="clear" w:color="auto" w:fill="F3F6FA"/>
+          </w:tcPr>
+          <w:p>
+            <w:pPr>
+              <w:pStyle w:val="Textodetabla"/>
+            </w:pPr>
+            <w:r>
+              <w:rPr>
+                <w:sz w:val="19"/>
+              </w:rPr>
+              <w:t>0.1</w:t>
+            </w:r>
+          </w:p>
+        </w:tc>
+        <w:tc>
+          <w:tcPr>
+            <w:tcW w:type="dxa" w:w="899"/>
+            <w:vAlign w:val="top"/>
+            <w:shd w:val="clear" w:color="auto" w:fill="F3F6FA"/>
+          </w:tcPr>
+          <w:p>
+            <w:pPr>
+              <w:pStyle w:val="Textodetabla"/>
+            </w:pPr>
+            <w:r>
+              <w:rPr>
+                <w:sz w:val="19"/>
+              </w:rPr>
+              <w:t>Borrador</w:t>
             </w:r>
           </w:p>
         </w:tc>
@@ -2383,7 +2635,7 @@
         </w:trPr>
         <w:tc>
           <w:tcPr>
-            <w:tcW w:type="dxa" w:w="596"/>
+            <w:tcW w:type="dxa" w:w="479"/>
             <w:vAlign w:val="top"/>
           </w:tcPr>
           <w:p>
@@ -2400,7 +2652,7 @@
         </w:tc>
         <w:tc>
           <w:tcPr>
-            <w:tcW w:type="dxa" w:w="3047"/>
+            <w:tcW w:type="dxa" w:w="2636"/>
             <w:vAlign w:val="top"/>
           </w:tcPr>
           <w:p>
@@ -2417,7 +2669,7 @@
         </w:tc>
         <w:tc>
           <w:tcPr>
-            <w:tcW w:type="dxa" w:w="2782"/>
+            <w:tcW w:type="dxa" w:w="2336"/>
             <w:vAlign w:val="top"/>
           </w:tcPr>
           <w:p>
@@ -2436,7 +2688,7 @@
         </w:tc>
         <w:tc>
           <w:tcPr>
-            <w:tcW w:type="dxa" w:w="2186"/>
+            <w:tcW w:type="dxa" w:w="1677"/>
             <w:vAlign w:val="top"/>
           </w:tcPr>
           <w:p>
@@ -2453,7 +2705,7 @@
         </w:tc>
         <w:tc>
           <w:tcPr>
-            <w:tcW w:type="dxa" w:w="795"/>
+            <w:tcW w:type="dxa" w:w="599"/>
             <w:vAlign w:val="top"/>
           </w:tcPr>
           <w:p>
@@ -2465,6 +2717,40 @@
                 <w:sz w:val="19"/>
               </w:rPr>
               <w:t>P2</w:t>
+            </w:r>
+          </w:p>
+        </w:tc>
+        <w:tc>
+          <w:tcPr>
+            <w:tcW w:type="dxa" w:w="779"/>
+            <w:vAlign w:val="top"/>
+          </w:tcPr>
+          <w:p>
+            <w:pPr>
+              <w:pStyle w:val="Textodetabla"/>
+            </w:pPr>
+            <w:r>
+              <w:rPr>
+                <w:sz w:val="19"/>
+              </w:rPr>
+              <w:t>0.1</w:t>
+            </w:r>
+          </w:p>
+        </w:tc>
+        <w:tc>
+          <w:tcPr>
+            <w:tcW w:type="dxa" w:w="899"/>
+            <w:vAlign w:val="top"/>
+          </w:tcPr>
+          <w:p>
+            <w:pPr>
+              <w:pStyle w:val="Textodetabla"/>
+            </w:pPr>
+            <w:r>
+              <w:rPr>
+                <w:sz w:val="19"/>
+              </w:rPr>
+              <w:t>Borrador</w:t>
             </w:r>
           </w:p>
         </w:tc>
@@ -2475,7 +2761,7 @@
         </w:trPr>
         <w:tc>
           <w:tcPr>
-            <w:tcW w:type="dxa" w:w="596"/>
+            <w:tcW w:type="dxa" w:w="479"/>
             <w:vAlign w:val="top"/>
             <w:shd w:val="clear" w:color="auto" w:fill="F3F6FA"/>
           </w:tcPr>
@@ -2493,7 +2779,7 @@
         </w:tc>
         <w:tc>
           <w:tcPr>
-            <w:tcW w:type="dxa" w:w="3047"/>
+            <w:tcW w:type="dxa" w:w="2636"/>
             <w:vAlign w:val="top"/>
             <w:shd w:val="clear" w:color="auto" w:fill="F3F6FA"/>
           </w:tcPr>
@@ -2511,7 +2797,7 @@
         </w:tc>
         <w:tc>
           <w:tcPr>
-            <w:tcW w:type="dxa" w:w="2782"/>
+            <w:tcW w:type="dxa" w:w="2336"/>
             <w:vAlign w:val="top"/>
             <w:shd w:val="clear" w:color="auto" w:fill="F3F6FA"/>
           </w:tcPr>
@@ -2531,7 +2817,7 @@
         </w:tc>
         <w:tc>
           <w:tcPr>
-            <w:tcW w:type="dxa" w:w="2186"/>
+            <w:tcW w:type="dxa" w:w="1677"/>
             <w:vAlign w:val="top"/>
             <w:shd w:val="clear" w:color="auto" w:fill="F3F6FA"/>
           </w:tcPr>
@@ -2549,7 +2835,7 @@
         </w:tc>
         <w:tc>
           <w:tcPr>
-            <w:tcW w:type="dxa" w:w="795"/>
+            <w:tcW w:type="dxa" w:w="599"/>
             <w:vAlign w:val="top"/>
             <w:shd w:val="clear" w:color="auto" w:fill="F3F6FA"/>
           </w:tcPr>
@@ -2562,6 +2848,42 @@
                 <w:sz w:val="19"/>
               </w:rPr>
               <w:t>P3</w:t>
+            </w:r>
+          </w:p>
+        </w:tc>
+        <w:tc>
+          <w:tcPr>
+            <w:tcW w:type="dxa" w:w="779"/>
+            <w:vAlign w:val="top"/>
+            <w:shd w:val="clear" w:color="auto" w:fill="F3F6FA"/>
+          </w:tcPr>
+          <w:p>
+            <w:pPr>
+              <w:pStyle w:val="Textodetabla"/>
+            </w:pPr>
+            <w:r>
+              <w:rPr>
+                <w:sz w:val="19"/>
+              </w:rPr>
+              <w:t>0.1</w:t>
+            </w:r>
+          </w:p>
+        </w:tc>
+        <w:tc>
+          <w:tcPr>
+            <w:tcW w:type="dxa" w:w="899"/>
+            <w:vAlign w:val="top"/>
+            <w:shd w:val="clear" w:color="auto" w:fill="F3F6FA"/>
+          </w:tcPr>
+          <w:p>
+            <w:pPr>
+              <w:pStyle w:val="Textodetabla"/>
+            </w:pPr>
+            <w:r>
+              <w:rPr>
+                <w:sz w:val="19"/>
+              </w:rPr>
+              <w:t>Borrador</w:t>
             </w:r>
           </w:p>
         </w:tc>
@@ -2572,7 +2894,7 @@
         </w:trPr>
         <w:tc>
           <w:tcPr>
-            <w:tcW w:type="dxa" w:w="596"/>
+            <w:tcW w:type="dxa" w:w="479"/>
             <w:vAlign w:val="top"/>
           </w:tcPr>
           <w:p>
@@ -2589,7 +2911,7 @@
         </w:tc>
         <w:tc>
           <w:tcPr>
-            <w:tcW w:type="dxa" w:w="3047"/>
+            <w:tcW w:type="dxa" w:w="2636"/>
             <w:vAlign w:val="top"/>
           </w:tcPr>
           <w:p>
@@ -2606,7 +2928,7 @@
         </w:tc>
         <w:tc>
           <w:tcPr>
-            <w:tcW w:type="dxa" w:w="2782"/>
+            <w:tcW w:type="dxa" w:w="2336"/>
             <w:vAlign w:val="top"/>
           </w:tcPr>
           <w:p>
@@ -2625,7 +2947,7 @@
         </w:tc>
         <w:tc>
           <w:tcPr>
-            <w:tcW w:type="dxa" w:w="2186"/>
+            <w:tcW w:type="dxa" w:w="1677"/>
             <w:vAlign w:val="top"/>
           </w:tcPr>
           <w:p>
@@ -2642,7 +2964,7 @@
         </w:tc>
         <w:tc>
           <w:tcPr>
-            <w:tcW w:type="dxa" w:w="795"/>
+            <w:tcW w:type="dxa" w:w="599"/>
             <w:vAlign w:val="top"/>
           </w:tcPr>
           <w:p>
@@ -2654,6 +2976,40 @@
                 <w:sz w:val="19"/>
               </w:rPr>
               <w:t>P3</w:t>
+            </w:r>
+          </w:p>
+        </w:tc>
+        <w:tc>
+          <w:tcPr>
+            <w:tcW w:type="dxa" w:w="779"/>
+            <w:vAlign w:val="top"/>
+          </w:tcPr>
+          <w:p>
+            <w:pPr>
+              <w:pStyle w:val="Textodetabla"/>
+            </w:pPr>
+            <w:r>
+              <w:rPr>
+                <w:sz w:val="19"/>
+              </w:rPr>
+              <w:t>0.1</w:t>
+            </w:r>
+          </w:p>
+        </w:tc>
+        <w:tc>
+          <w:tcPr>
+            <w:tcW w:type="dxa" w:w="899"/>
+            <w:vAlign w:val="top"/>
+          </w:tcPr>
+          <w:p>
+            <w:pPr>
+              <w:pStyle w:val="Textodetabla"/>
+            </w:pPr>
+            <w:r>
+              <w:rPr>
+                <w:sz w:val="19"/>
+              </w:rPr>
+              <w:t>Borrador</w:t>
             </w:r>
           </w:p>
         </w:tc>
@@ -2664,7 +3020,7 @@
         </w:trPr>
         <w:tc>
           <w:tcPr>
-            <w:tcW w:type="dxa" w:w="596"/>
+            <w:tcW w:type="dxa" w:w="479"/>
             <w:vAlign w:val="top"/>
             <w:shd w:val="clear" w:color="auto" w:fill="F3F6FA"/>
           </w:tcPr>
@@ -2682,7 +3038,7 @@
         </w:tc>
         <w:tc>
           <w:tcPr>
-            <w:tcW w:type="dxa" w:w="3047"/>
+            <w:tcW w:type="dxa" w:w="2636"/>
             <w:vAlign w:val="top"/>
             <w:shd w:val="clear" w:color="auto" w:fill="F3F6FA"/>
           </w:tcPr>
@@ -2700,7 +3056,7 @@
         </w:tc>
         <w:tc>
           <w:tcPr>
-            <w:tcW w:type="dxa" w:w="2782"/>
+            <w:tcW w:type="dxa" w:w="2336"/>
             <w:vAlign w:val="top"/>
             <w:shd w:val="clear" w:color="auto" w:fill="F3F6FA"/>
           </w:tcPr>
@@ -2720,7 +3076,7 @@
         </w:tc>
         <w:tc>
           <w:tcPr>
-            <w:tcW w:type="dxa" w:w="2186"/>
+            <w:tcW w:type="dxa" w:w="1677"/>
             <w:vAlign w:val="top"/>
             <w:shd w:val="clear" w:color="auto" w:fill="F3F6FA"/>
           </w:tcPr>
@@ -2738,7 +3094,7 @@
         </w:tc>
         <w:tc>
           <w:tcPr>
-            <w:tcW w:type="dxa" w:w="795"/>
+            <w:tcW w:type="dxa" w:w="599"/>
             <w:vAlign w:val="top"/>
             <w:shd w:val="clear" w:color="auto" w:fill="F3F6FA"/>
           </w:tcPr>
@@ -2751,6 +3107,42 @@
                 <w:sz w:val="19"/>
               </w:rPr>
               <w:t>P1</w:t>
+            </w:r>
+          </w:p>
+        </w:tc>
+        <w:tc>
+          <w:tcPr>
+            <w:tcW w:type="dxa" w:w="779"/>
+            <w:vAlign w:val="top"/>
+            <w:shd w:val="clear" w:color="auto" w:fill="F3F6FA"/>
+          </w:tcPr>
+          <w:p>
+            <w:pPr>
+              <w:pStyle w:val="Textodetabla"/>
+            </w:pPr>
+            <w:r>
+              <w:rPr>
+                <w:sz w:val="19"/>
+              </w:rPr>
+              <w:t>0.1</w:t>
+            </w:r>
+          </w:p>
+        </w:tc>
+        <w:tc>
+          <w:tcPr>
+            <w:tcW w:type="dxa" w:w="899"/>
+            <w:vAlign w:val="top"/>
+            <w:shd w:val="clear" w:color="auto" w:fill="F3F6FA"/>
+          </w:tcPr>
+          <w:p>
+            <w:pPr>
+              <w:pStyle w:val="Textodetabla"/>
+            </w:pPr>
+            <w:r>
+              <w:rPr>
+                <w:sz w:val="19"/>
+              </w:rPr>
+              <w:t>Borrador</w:t>
             </w:r>
           </w:p>
         </w:tc>
@@ -2761,7 +3153,7 @@
         </w:trPr>
         <w:tc>
           <w:tcPr>
-            <w:tcW w:type="dxa" w:w="596"/>
+            <w:tcW w:type="dxa" w:w="479"/>
             <w:vAlign w:val="top"/>
           </w:tcPr>
           <w:p>
@@ -2778,7 +3170,7 @@
         </w:tc>
         <w:tc>
           <w:tcPr>
-            <w:tcW w:type="dxa" w:w="3047"/>
+            <w:tcW w:type="dxa" w:w="2636"/>
             <w:vAlign w:val="top"/>
           </w:tcPr>
           <w:p>
@@ -2795,7 +3187,7 @@
         </w:tc>
         <w:tc>
           <w:tcPr>
-            <w:tcW w:type="dxa" w:w="2782"/>
+            <w:tcW w:type="dxa" w:w="2336"/>
             <w:vAlign w:val="top"/>
           </w:tcPr>
           <w:p>
@@ -2814,7 +3206,7 @@
         </w:tc>
         <w:tc>
           <w:tcPr>
-            <w:tcW w:type="dxa" w:w="2186"/>
+            <w:tcW w:type="dxa" w:w="1677"/>
             <w:vAlign w:val="top"/>
           </w:tcPr>
           <w:p>
@@ -2831,7 +3223,7 @@
         </w:tc>
         <w:tc>
           <w:tcPr>
-            <w:tcW w:type="dxa" w:w="795"/>
+            <w:tcW w:type="dxa" w:w="599"/>
             <w:vAlign w:val="top"/>
           </w:tcPr>
           <w:p>
@@ -2843,6 +3235,40 @@
                 <w:sz w:val="19"/>
               </w:rPr>
               <w:t>P2</w:t>
+            </w:r>
+          </w:p>
+        </w:tc>
+        <w:tc>
+          <w:tcPr>
+            <w:tcW w:type="dxa" w:w="779"/>
+            <w:vAlign w:val="top"/>
+          </w:tcPr>
+          <w:p>
+            <w:pPr>
+              <w:pStyle w:val="Textodetabla"/>
+            </w:pPr>
+            <w:r>
+              <w:rPr>
+                <w:sz w:val="19"/>
+              </w:rPr>
+              <w:t>0.1</w:t>
+            </w:r>
+          </w:p>
+        </w:tc>
+        <w:tc>
+          <w:tcPr>
+            <w:tcW w:type="dxa" w:w="899"/>
+            <w:vAlign w:val="top"/>
+          </w:tcPr>
+          <w:p>
+            <w:pPr>
+              <w:pStyle w:val="Textodetabla"/>
+            </w:pPr>
+            <w:r>
+              <w:rPr>
+                <w:sz w:val="19"/>
+              </w:rPr>
+              <w:t>Borrador</w:t>
             </w:r>
           </w:p>
         </w:tc>
@@ -2853,7 +3279,7 @@
         </w:trPr>
         <w:tc>
           <w:tcPr>
-            <w:tcW w:type="dxa" w:w="596"/>
+            <w:tcW w:type="dxa" w:w="479"/>
             <w:vAlign w:val="top"/>
             <w:shd w:val="clear" w:color="auto" w:fill="F3F6FA"/>
           </w:tcPr>
@@ -2871,7 +3297,7 @@
         </w:tc>
         <w:tc>
           <w:tcPr>
-            <w:tcW w:type="dxa" w:w="3047"/>
+            <w:tcW w:type="dxa" w:w="2636"/>
             <w:vAlign w:val="top"/>
             <w:shd w:val="clear" w:color="auto" w:fill="F3F6FA"/>
           </w:tcPr>
@@ -2889,7 +3315,7 @@
         </w:tc>
         <w:tc>
           <w:tcPr>
-            <w:tcW w:type="dxa" w:w="2782"/>
+            <w:tcW w:type="dxa" w:w="2336"/>
             <w:vAlign w:val="top"/>
             <w:shd w:val="clear" w:color="auto" w:fill="F3F6FA"/>
           </w:tcPr>
@@ -2909,7 +3335,7 @@
         </w:tc>
         <w:tc>
           <w:tcPr>
-            <w:tcW w:type="dxa" w:w="2186"/>
+            <w:tcW w:type="dxa" w:w="1677"/>
             <w:vAlign w:val="top"/>
             <w:shd w:val="clear" w:color="auto" w:fill="F3F6FA"/>
           </w:tcPr>
@@ -2927,7 +3353,7 @@
         </w:tc>
         <w:tc>
           <w:tcPr>
-            <w:tcW w:type="dxa" w:w="795"/>
+            <w:tcW w:type="dxa" w:w="599"/>
             <w:vAlign w:val="top"/>
             <w:shd w:val="clear" w:color="auto" w:fill="F3F6FA"/>
           </w:tcPr>
@@ -2940,6 +3366,42 @@
                 <w:sz w:val="19"/>
               </w:rPr>
               <w:t>P1</w:t>
+            </w:r>
+          </w:p>
+        </w:tc>
+        <w:tc>
+          <w:tcPr>
+            <w:tcW w:type="dxa" w:w="779"/>
+            <w:vAlign w:val="top"/>
+            <w:shd w:val="clear" w:color="auto" w:fill="F3F6FA"/>
+          </w:tcPr>
+          <w:p>
+            <w:pPr>
+              <w:pStyle w:val="Textodetabla"/>
+            </w:pPr>
+            <w:r>
+              <w:rPr>
+                <w:sz w:val="19"/>
+              </w:rPr>
+              <w:t>0.1</w:t>
+            </w:r>
+          </w:p>
+        </w:tc>
+        <w:tc>
+          <w:tcPr>
+            <w:tcW w:type="dxa" w:w="899"/>
+            <w:vAlign w:val="top"/>
+            <w:shd w:val="clear" w:color="auto" w:fill="F3F6FA"/>
+          </w:tcPr>
+          <w:p>
+            <w:pPr>
+              <w:pStyle w:val="Textodetabla"/>
+            </w:pPr>
+            <w:r>
+              <w:rPr>
+                <w:sz w:val="19"/>
+              </w:rPr>
+              <w:t>Borrador</w:t>
             </w:r>
           </w:p>
         </w:tc>
@@ -2950,7 +3412,7 @@
         </w:trPr>
         <w:tc>
           <w:tcPr>
-            <w:tcW w:type="dxa" w:w="596"/>
+            <w:tcW w:type="dxa" w:w="479"/>
             <w:vAlign w:val="top"/>
           </w:tcPr>
           <w:p>
@@ -2967,7 +3429,7 @@
         </w:tc>
         <w:tc>
           <w:tcPr>
-            <w:tcW w:type="dxa" w:w="3047"/>
+            <w:tcW w:type="dxa" w:w="2636"/>
             <w:vAlign w:val="top"/>
           </w:tcPr>
           <w:p>
@@ -2984,7 +3446,7 @@
         </w:tc>
         <w:tc>
           <w:tcPr>
-            <w:tcW w:type="dxa" w:w="2782"/>
+            <w:tcW w:type="dxa" w:w="2336"/>
             <w:vAlign w:val="top"/>
           </w:tcPr>
           <w:p>
@@ -3003,7 +3465,7 @@
         </w:tc>
         <w:tc>
           <w:tcPr>
-            <w:tcW w:type="dxa" w:w="2186"/>
+            <w:tcW w:type="dxa" w:w="1677"/>
             <w:vAlign w:val="top"/>
           </w:tcPr>
           <w:p>
@@ -3020,7 +3482,7 @@
         </w:tc>
         <w:tc>
           <w:tcPr>
-            <w:tcW w:type="dxa" w:w="795"/>
+            <w:tcW w:type="dxa" w:w="599"/>
             <w:vAlign w:val="top"/>
           </w:tcPr>
           <w:p>
@@ -3032,6 +3494,40 @@
                 <w:sz w:val="19"/>
               </w:rPr>
               <w:t>P1</w:t>
+            </w:r>
+          </w:p>
+        </w:tc>
+        <w:tc>
+          <w:tcPr>
+            <w:tcW w:type="dxa" w:w="779"/>
+            <w:vAlign w:val="top"/>
+          </w:tcPr>
+          <w:p>
+            <w:pPr>
+              <w:pStyle w:val="Textodetabla"/>
+            </w:pPr>
+            <w:r>
+              <w:rPr>
+                <w:sz w:val="19"/>
+              </w:rPr>
+              <w:t>0.1</w:t>
+            </w:r>
+          </w:p>
+        </w:tc>
+        <w:tc>
+          <w:tcPr>
+            <w:tcW w:type="dxa" w:w="899"/>
+            <w:vAlign w:val="top"/>
+          </w:tcPr>
+          <w:p>
+            <w:pPr>
+              <w:pStyle w:val="Textodetabla"/>
+            </w:pPr>
+            <w:r>
+              <w:rPr>
+                <w:sz w:val="19"/>
+              </w:rPr>
+              <w:t>Borrador</w:t>
             </w:r>
           </w:p>
         </w:tc>
@@ -3042,7 +3538,7 @@
         </w:trPr>
         <w:tc>
           <w:tcPr>
-            <w:tcW w:type="dxa" w:w="596"/>
+            <w:tcW w:type="dxa" w:w="479"/>
             <w:vAlign w:val="top"/>
             <w:shd w:val="clear" w:color="auto" w:fill="F3F6FA"/>
           </w:tcPr>
@@ -3060,7 +3556,7 @@
         </w:tc>
         <w:tc>
           <w:tcPr>
-            <w:tcW w:type="dxa" w:w="3047"/>
+            <w:tcW w:type="dxa" w:w="2636"/>
             <w:vAlign w:val="top"/>
             <w:shd w:val="clear" w:color="auto" w:fill="F3F6FA"/>
           </w:tcPr>
@@ -3078,7 +3574,7 @@
         </w:tc>
         <w:tc>
           <w:tcPr>
-            <w:tcW w:type="dxa" w:w="2782"/>
+            <w:tcW w:type="dxa" w:w="2336"/>
             <w:vAlign w:val="top"/>
             <w:shd w:val="clear" w:color="auto" w:fill="F3F6FA"/>
           </w:tcPr>
@@ -3098,7 +3594,7 @@
         </w:tc>
         <w:tc>
           <w:tcPr>
-            <w:tcW w:type="dxa" w:w="2186"/>
+            <w:tcW w:type="dxa" w:w="1677"/>
             <w:vAlign w:val="top"/>
             <w:shd w:val="clear" w:color="auto" w:fill="F3F6FA"/>
           </w:tcPr>
@@ -3116,7 +3612,7 @@
         </w:tc>
         <w:tc>
           <w:tcPr>
-            <w:tcW w:type="dxa" w:w="795"/>
+            <w:tcW w:type="dxa" w:w="599"/>
             <w:vAlign w:val="top"/>
             <w:shd w:val="clear" w:color="auto" w:fill="F3F6FA"/>
           </w:tcPr>
@@ -3129,6 +3625,42 @@
                 <w:sz w:val="19"/>
               </w:rPr>
               <w:t>P2</w:t>
+            </w:r>
+          </w:p>
+        </w:tc>
+        <w:tc>
+          <w:tcPr>
+            <w:tcW w:type="dxa" w:w="779"/>
+            <w:vAlign w:val="top"/>
+            <w:shd w:val="clear" w:color="auto" w:fill="F3F6FA"/>
+          </w:tcPr>
+          <w:p>
+            <w:pPr>
+              <w:pStyle w:val="Textodetabla"/>
+            </w:pPr>
+            <w:r>
+              <w:rPr>
+                <w:sz w:val="19"/>
+              </w:rPr>
+              <w:t>0.1</w:t>
+            </w:r>
+          </w:p>
+        </w:tc>
+        <w:tc>
+          <w:tcPr>
+            <w:tcW w:type="dxa" w:w="899"/>
+            <w:vAlign w:val="top"/>
+            <w:shd w:val="clear" w:color="auto" w:fill="F3F6FA"/>
+          </w:tcPr>
+          <w:p>
+            <w:pPr>
+              <w:pStyle w:val="Textodetabla"/>
+            </w:pPr>
+            <w:r>
+              <w:rPr>
+                <w:sz w:val="19"/>
+              </w:rPr>
+              <w:t>Borrador</w:t>
             </w:r>
           </w:p>
         </w:tc>
@@ -3139,7 +3671,7 @@
         </w:trPr>
         <w:tc>
           <w:tcPr>
-            <w:tcW w:type="dxa" w:w="596"/>
+            <w:tcW w:type="dxa" w:w="479"/>
             <w:vAlign w:val="top"/>
           </w:tcPr>
           <w:p>
@@ -3156,7 +3688,7 @@
         </w:tc>
         <w:tc>
           <w:tcPr>
-            <w:tcW w:type="dxa" w:w="3047"/>
+            <w:tcW w:type="dxa" w:w="2636"/>
             <w:vAlign w:val="top"/>
           </w:tcPr>
           <w:p>
@@ -3173,7 +3705,7 @@
         </w:tc>
         <w:tc>
           <w:tcPr>
-            <w:tcW w:type="dxa" w:w="2782"/>
+            <w:tcW w:type="dxa" w:w="2336"/>
             <w:vAlign w:val="top"/>
           </w:tcPr>
           <w:p>
@@ -3192,7 +3724,7 @@
         </w:tc>
         <w:tc>
           <w:tcPr>
-            <w:tcW w:type="dxa" w:w="2186"/>
+            <w:tcW w:type="dxa" w:w="1677"/>
             <w:vAlign w:val="top"/>
           </w:tcPr>
           <w:p>
@@ -3209,7 +3741,7 @@
         </w:tc>
         <w:tc>
           <w:tcPr>
-            <w:tcW w:type="dxa" w:w="795"/>
+            <w:tcW w:type="dxa" w:w="599"/>
             <w:vAlign w:val="top"/>
           </w:tcPr>
           <w:p>
@@ -3221,6 +3753,40 @@
                 <w:sz w:val="19"/>
               </w:rPr>
               <w:t>P1</w:t>
+            </w:r>
+          </w:p>
+        </w:tc>
+        <w:tc>
+          <w:tcPr>
+            <w:tcW w:type="dxa" w:w="779"/>
+            <w:vAlign w:val="top"/>
+          </w:tcPr>
+          <w:p>
+            <w:pPr>
+              <w:pStyle w:val="Textodetabla"/>
+            </w:pPr>
+            <w:r>
+              <w:rPr>
+                <w:sz w:val="19"/>
+              </w:rPr>
+              <w:t>0.1</w:t>
+            </w:r>
+          </w:p>
+        </w:tc>
+        <w:tc>
+          <w:tcPr>
+            <w:tcW w:type="dxa" w:w="899"/>
+            <w:vAlign w:val="top"/>
+          </w:tcPr>
+          <w:p>
+            <w:pPr>
+              <w:pStyle w:val="Textodetabla"/>
+            </w:pPr>
+            <w:r>
+              <w:rPr>
+                <w:sz w:val="19"/>
+              </w:rPr>
+              <w:t>Borrador</w:t>
             </w:r>
           </w:p>
         </w:tc>
@@ -3231,7 +3797,7 @@
         </w:trPr>
         <w:tc>
           <w:tcPr>
-            <w:tcW w:type="dxa" w:w="596"/>
+            <w:tcW w:type="dxa" w:w="479"/>
             <w:vAlign w:val="top"/>
             <w:shd w:val="clear" w:color="auto" w:fill="F3F6FA"/>
           </w:tcPr>
@@ -3249,7 +3815,7 @@
         </w:tc>
         <w:tc>
           <w:tcPr>
-            <w:tcW w:type="dxa" w:w="3047"/>
+            <w:tcW w:type="dxa" w:w="2636"/>
             <w:vAlign w:val="top"/>
             <w:shd w:val="clear" w:color="auto" w:fill="F3F6FA"/>
           </w:tcPr>
@@ -3267,7 +3833,7 @@
         </w:tc>
         <w:tc>
           <w:tcPr>
-            <w:tcW w:type="dxa" w:w="2782"/>
+            <w:tcW w:type="dxa" w:w="2336"/>
             <w:vAlign w:val="top"/>
             <w:shd w:val="clear" w:color="auto" w:fill="F3F6FA"/>
           </w:tcPr>
@@ -3287,7 +3853,7 @@
         </w:tc>
         <w:tc>
           <w:tcPr>
-            <w:tcW w:type="dxa" w:w="2186"/>
+            <w:tcW w:type="dxa" w:w="1677"/>
             <w:vAlign w:val="top"/>
             <w:shd w:val="clear" w:color="auto" w:fill="F3F6FA"/>
           </w:tcPr>
@@ -3305,7 +3871,7 @@
         </w:tc>
         <w:tc>
           <w:tcPr>
-            <w:tcW w:type="dxa" w:w="795"/>
+            <w:tcW w:type="dxa" w:w="599"/>
             <w:vAlign w:val="top"/>
             <w:shd w:val="clear" w:color="auto" w:fill="F3F6FA"/>
           </w:tcPr>
@@ -3318,6 +3884,42 @@
                 <w:sz w:val="19"/>
               </w:rPr>
               <w:t>P2</w:t>
+            </w:r>
+          </w:p>
+        </w:tc>
+        <w:tc>
+          <w:tcPr>
+            <w:tcW w:type="dxa" w:w="779"/>
+            <w:vAlign w:val="top"/>
+            <w:shd w:val="clear" w:color="auto" w:fill="F3F6FA"/>
+          </w:tcPr>
+          <w:p>
+            <w:pPr>
+              <w:pStyle w:val="Textodetabla"/>
+            </w:pPr>
+            <w:r>
+              <w:rPr>
+                <w:sz w:val="19"/>
+              </w:rPr>
+              <w:t>0.1</w:t>
+            </w:r>
+          </w:p>
+        </w:tc>
+        <w:tc>
+          <w:tcPr>
+            <w:tcW w:type="dxa" w:w="899"/>
+            <w:vAlign w:val="top"/>
+            <w:shd w:val="clear" w:color="auto" w:fill="F3F6FA"/>
+          </w:tcPr>
+          <w:p>
+            <w:pPr>
+              <w:pStyle w:val="Textodetabla"/>
+            </w:pPr>
+            <w:r>
+              <w:rPr>
+                <w:sz w:val="19"/>
+              </w:rPr>
+              <w:t>Borrador</w:t>
             </w:r>
           </w:p>
         </w:tc>
@@ -3328,7 +3930,7 @@
         </w:trPr>
         <w:tc>
           <w:tcPr>
-            <w:tcW w:type="dxa" w:w="596"/>
+            <w:tcW w:type="dxa" w:w="479"/>
             <w:vAlign w:val="top"/>
           </w:tcPr>
           <w:p>
@@ -3345,7 +3947,7 @@
         </w:tc>
         <w:tc>
           <w:tcPr>
-            <w:tcW w:type="dxa" w:w="3047"/>
+            <w:tcW w:type="dxa" w:w="2636"/>
             <w:vAlign w:val="top"/>
           </w:tcPr>
           <w:p>
@@ -3362,7 +3964,7 @@
         </w:tc>
         <w:tc>
           <w:tcPr>
-            <w:tcW w:type="dxa" w:w="2782"/>
+            <w:tcW w:type="dxa" w:w="2336"/>
             <w:vAlign w:val="top"/>
           </w:tcPr>
           <w:p>
@@ -3381,7 +3983,7 @@
         </w:tc>
         <w:tc>
           <w:tcPr>
-            <w:tcW w:type="dxa" w:w="2186"/>
+            <w:tcW w:type="dxa" w:w="1677"/>
             <w:vAlign w:val="top"/>
           </w:tcPr>
           <w:p>
@@ -3398,7 +4000,7 @@
         </w:tc>
         <w:tc>
           <w:tcPr>
-            <w:tcW w:type="dxa" w:w="795"/>
+            <w:tcW w:type="dxa" w:w="599"/>
             <w:vAlign w:val="top"/>
           </w:tcPr>
           <w:p>
@@ -3410,6 +4012,40 @@
                 <w:sz w:val="19"/>
               </w:rPr>
               <w:t>P2</w:t>
+            </w:r>
+          </w:p>
+        </w:tc>
+        <w:tc>
+          <w:tcPr>
+            <w:tcW w:type="dxa" w:w="779"/>
+            <w:vAlign w:val="top"/>
+          </w:tcPr>
+          <w:p>
+            <w:pPr>
+              <w:pStyle w:val="Textodetabla"/>
+            </w:pPr>
+            <w:r>
+              <w:rPr>
+                <w:sz w:val="19"/>
+              </w:rPr>
+              <w:t>0.1</w:t>
+            </w:r>
+          </w:p>
+        </w:tc>
+        <w:tc>
+          <w:tcPr>
+            <w:tcW w:type="dxa" w:w="899"/>
+            <w:vAlign w:val="top"/>
+          </w:tcPr>
+          <w:p>
+            <w:pPr>
+              <w:pStyle w:val="Textodetabla"/>
+            </w:pPr>
+            <w:r>
+              <w:rPr>
+                <w:sz w:val="19"/>
+              </w:rPr>
+              <w:t>Borrador</w:t>
             </w:r>
           </w:p>
         </w:tc>
@@ -5758,10 +6394,10 @@
       </w:tblPr>
       <w:tblGrid>
         <w:gridCol w:w="1521"/>
-        <w:gridCol w:w="1798"/>
         <w:gridCol w:w="1659"/>
-        <w:gridCol w:w="2213"/>
-        <w:gridCol w:w="2213"/>
+        <w:gridCol w:w="1590"/>
+        <w:gridCol w:w="2144"/>
+        <w:gridCol w:w="2489"/>
       </w:tblGrid>
       <w:tr>
         <w:trPr>
@@ -5790,26 +6426,6 @@
         </w:tc>
         <w:tc>
           <w:tcPr>
-            <w:tcW w:type="dxa" w:w="1798"/>
-            <w:vAlign w:val="center"/>
-            <w:shd w:val="clear" w:color="auto" w:fill="1F3A5F"/>
-          </w:tcPr>
-          <w:p>
-            <w:pPr>
-              <w:pStyle w:val="Textodetabla"/>
-            </w:pPr>
-            <w:r>
-              <w:rPr>
-                <w:b/>
-                <w:color w:val="FFFFFF"/>
-                <w:sz w:val="19"/>
-              </w:rPr>
-              <w:t>Requerimientos</w:t>
-            </w:r>
-          </w:p>
-        </w:tc>
-        <w:tc>
-          <w:tcPr>
             <w:tcW w:type="dxa" w:w="1660"/>
             <w:vAlign w:val="center"/>
             <w:shd w:val="clear" w:color="auto" w:fill="1F3A5F"/>
@@ -5824,13 +6440,13 @@
                 <w:color w:val="FFFFFF"/>
                 <w:sz w:val="19"/>
               </w:rPr>
-              <w:t>Componentes</w:t>
-            </w:r>
-          </w:p>
-        </w:tc>
-        <w:tc>
-          <w:tcPr>
-            <w:tcW w:type="dxa" w:w="2213"/>
+              <w:t>Requerimientos</w:t>
+            </w:r>
+          </w:p>
+        </w:tc>
+        <w:tc>
+          <w:tcPr>
+            <w:tcW w:type="dxa" w:w="1591"/>
             <w:vAlign w:val="center"/>
             <w:shd w:val="clear" w:color="auto" w:fill="1F3A5F"/>
           </w:tcPr>
@@ -5844,13 +6460,33 @@
                 <w:color w:val="FFFFFF"/>
                 <w:sz w:val="19"/>
               </w:rPr>
+              <w:t>Componentes</w:t>
+            </w:r>
+          </w:p>
+        </w:tc>
+        <w:tc>
+          <w:tcPr>
+            <w:tcW w:type="dxa" w:w="2144"/>
+            <w:vAlign w:val="center"/>
+            <w:shd w:val="clear" w:color="auto" w:fill="1F3A5F"/>
+          </w:tcPr>
+          <w:p>
+            <w:pPr>
+              <w:pStyle w:val="Textodetabla"/>
+            </w:pPr>
+            <w:r>
+              <w:rPr>
+                <w:b/>
+                <w:color w:val="FFFFFF"/>
+                <w:sz w:val="19"/>
+              </w:rPr>
               <w:t>Pruebas</w:t>
             </w:r>
           </w:p>
         </w:tc>
         <w:tc>
           <w:tcPr>
-            <w:tcW w:type="dxa" w:w="2213"/>
+            <w:tcW w:type="dxa" w:w="2490"/>
             <w:vAlign w:val="center"/>
             <w:shd w:val="clear" w:color="auto" w:fill="1F3A5F"/>
           </w:tcPr>
@@ -5892,7 +6528,7 @@
         </w:tc>
         <w:tc>
           <w:tcPr>
-            <w:tcW w:type="dxa" w:w="1798"/>
+            <w:tcW w:type="dxa" w:w="1660"/>
             <w:vAlign w:val="top"/>
           </w:tcPr>
           <w:p>
@@ -5909,7 +6545,7 @@
         </w:tc>
         <w:tc>
           <w:tcPr>
-            <w:tcW w:type="dxa" w:w="1660"/>
+            <w:tcW w:type="dxa" w:w="1591"/>
             <w:vAlign w:val="top"/>
           </w:tcPr>
           <w:p>
@@ -5926,7 +6562,7 @@
         </w:tc>
         <w:tc>
           <w:tcPr>
-            <w:tcW w:type="dxa" w:w="2213"/>
+            <w:tcW w:type="dxa" w:w="2144"/>
             <w:vAlign w:val="top"/>
           </w:tcPr>
           <w:p>
@@ -5943,7 +6579,7 @@
         </w:tc>
         <w:tc>
           <w:tcPr>
-            <w:tcW w:type="dxa" w:w="2213"/>
+            <w:tcW w:type="dxa" w:w="2490"/>
             <w:vAlign w:val="top"/>
           </w:tcPr>
           <w:p>
@@ -6003,7 +6639,7 @@
         </w:tc>
         <w:tc>
           <w:tcPr>
-            <w:tcW w:type="dxa" w:w="1798"/>
+            <w:tcW w:type="dxa" w:w="1660"/>
             <w:vAlign w:val="top"/>
             <w:shd w:val="clear" w:color="auto" w:fill="F3F6FA"/>
           </w:tcPr>
@@ -6021,7 +6657,7 @@
         </w:tc>
         <w:tc>
           <w:tcPr>
-            <w:tcW w:type="dxa" w:w="1660"/>
+            <w:tcW w:type="dxa" w:w="1591"/>
             <w:vAlign w:val="top"/>
             <w:shd w:val="clear" w:color="auto" w:fill="F3F6FA"/>
           </w:tcPr>
@@ -6039,7 +6675,7 @@
         </w:tc>
         <w:tc>
           <w:tcPr>
-            <w:tcW w:type="dxa" w:w="2213"/>
+            <w:tcW w:type="dxa" w:w="2144"/>
             <w:vAlign w:val="top"/>
             <w:shd w:val="clear" w:color="auto" w:fill="F3F6FA"/>
           </w:tcPr>
@@ -6065,7 +6701,7 @@
         </w:tc>
         <w:tc>
           <w:tcPr>
-            <w:tcW w:type="dxa" w:w="2213"/>
+            <w:tcW w:type="dxa" w:w="2490"/>
             <w:vAlign w:val="top"/>
             <w:shd w:val="clear" w:color="auto" w:fill="F3F6FA"/>
           </w:tcPr>
@@ -6139,7 +6775,7 @@
         </w:tc>
         <w:tc>
           <w:tcPr>
-            <w:tcW w:type="dxa" w:w="1798"/>
+            <w:tcW w:type="dxa" w:w="1660"/>
             <w:vAlign w:val="top"/>
           </w:tcPr>
           <w:p>
@@ -6156,7 +6792,7 @@
         </w:tc>
         <w:tc>
           <w:tcPr>
-            <w:tcW w:type="dxa" w:w="1660"/>
+            <w:tcW w:type="dxa" w:w="1591"/>
             <w:vAlign w:val="top"/>
           </w:tcPr>
           <w:p>
@@ -6173,7 +6809,7 @@
         </w:tc>
         <w:tc>
           <w:tcPr>
-            <w:tcW w:type="dxa" w:w="2213"/>
+            <w:tcW w:type="dxa" w:w="2144"/>
             <w:vAlign w:val="top"/>
           </w:tcPr>
           <w:p>
@@ -6226,7 +6862,7 @@
         </w:tc>
         <w:tc>
           <w:tcPr>
-            <w:tcW w:type="dxa" w:w="2213"/>
+            <w:tcW w:type="dxa" w:w="2490"/>
             <w:vAlign w:val="top"/>
           </w:tcPr>
           <w:p>
@@ -6271,7 +6907,7 @@
               <w:rPr>
                 <w:sz w:val="19"/>
               </w:rPr>
-              <w:t xml:space="preserve"> inyección contra el modelo</w:t>
+              <w:t xml:space="preserve"> desvío de familia contra el modelo real</w:t>
             </w:r>
           </w:p>
         </w:tc>
@@ -6300,7 +6936,7 @@
         </w:tc>
         <w:tc>
           <w:tcPr>
-            <w:tcW w:type="dxa" w:w="1798"/>
+            <w:tcW w:type="dxa" w:w="1660"/>
             <w:vAlign w:val="top"/>
             <w:shd w:val="clear" w:color="auto" w:fill="F3F6FA"/>
           </w:tcPr>
@@ -6318,7 +6954,7 @@
         </w:tc>
         <w:tc>
           <w:tcPr>
-            <w:tcW w:type="dxa" w:w="1660"/>
+            <w:tcW w:type="dxa" w:w="1591"/>
             <w:vAlign w:val="top"/>
             <w:shd w:val="clear" w:color="auto" w:fill="F3F6FA"/>
           </w:tcPr>
@@ -6336,7 +6972,7 @@
         </w:tc>
         <w:tc>
           <w:tcPr>
-            <w:tcW w:type="dxa" w:w="2213"/>
+            <w:tcW w:type="dxa" w:w="2144"/>
             <w:vAlign w:val="top"/>
             <w:shd w:val="clear" w:color="auto" w:fill="F3F6FA"/>
           </w:tcPr>
@@ -6362,7 +6998,7 @@
         </w:tc>
         <w:tc>
           <w:tcPr>
-            <w:tcW w:type="dxa" w:w="2213"/>
+            <w:tcW w:type="dxa" w:w="2490"/>
             <w:vAlign w:val="top"/>
             <w:shd w:val="clear" w:color="auto" w:fill="F3F6FA"/>
           </w:tcPr>
@@ -6381,7 +7017,7 @@
               <w:rPr>
                 <w:sz w:val="19"/>
               </w:rPr>
-              <w:t xml:space="preserve"> chequeo 5 en el código; </w:t>
+              <w:t xml:space="preserve"> rechazo por cortacircuito o tope (chequeo 5); </w:t>
             </w:r>
             <w:r>
               <w:rPr>
@@ -6394,7 +7030,7 @@
               <w:rPr>
                 <w:sz w:val="19"/>
               </w:rPr>
-              <w:t xml:space="preserve"> prueba de estrés</w:t>
+              <w:t xml:space="preserve"> apertura automática y prueba de estrés</w:t>
             </w:r>
           </w:p>
         </w:tc>
@@ -6422,7 +7058,7 @@
         </w:tc>
         <w:tc>
           <w:tcPr>
-            <w:tcW w:type="dxa" w:w="1798"/>
+            <w:tcW w:type="dxa" w:w="1660"/>
             <w:vAlign w:val="top"/>
           </w:tcPr>
           <w:p>
@@ -6439,7 +7075,7 @@
         </w:tc>
         <w:tc>
           <w:tcPr>
-            <w:tcW w:type="dxa" w:w="1660"/>
+            <w:tcW w:type="dxa" w:w="1591"/>
             <w:vAlign w:val="top"/>
           </w:tcPr>
           <w:p>
@@ -6456,7 +7092,7 @@
         </w:tc>
         <w:tc>
           <w:tcPr>
-            <w:tcW w:type="dxa" w:w="2213"/>
+            <w:tcW w:type="dxa" w:w="2144"/>
             <w:vAlign w:val="top"/>
           </w:tcPr>
           <w:p>
@@ -6481,7 +7117,7 @@
         </w:tc>
         <w:tc>
           <w:tcPr>
-            <w:tcW w:type="dxa" w:w="2213"/>
+            <w:tcW w:type="dxa" w:w="2490"/>
             <w:vAlign w:val="top"/>
           </w:tcPr>
           <w:p>
@@ -6866,7 +7502,7 @@
                 <w:rFonts w:ascii="Segoe UI Emoji" w:hAnsi="Segoe UI Emoji"/>
                 <w:sz w:val="19"/>
               </w:rPr>
-              <w:t>🟡</w:t>
+              <w:t>✅</w:t>
             </w:r>
             <w:r>
               <w:rPr>
@@ -7729,21 +8365,7 @@
               <w:rPr>
                 <w:sz w:val="19"/>
               </w:rPr>
-              <w:t xml:space="preserve">El contexto prevé nombres </w:t>
-            </w:r>
-            <w:r>
-              <w:rPr>
-                <w:rFonts w:ascii="Consolas" w:hAnsi="Consolas"/>
-                <w:sz w:val="16"/>
-                <w:shd w:val="clear" w:color="auto" w:fill="F2F2F2"/>
-              </w:rPr>
-              <w:t>KRO-DOC-NN_tema.docx</w:t>
-            </w:r>
-            <w:r>
-              <w:rPr>
-                <w:sz w:val="19"/>
-              </w:rPr>
-              <w:t xml:space="preserve"> y otra lista de pospuestos en su sección 12.3. La instrucción de esta entrega pide </w:t>
+              <w:t xml:space="preserve">El contexto prevé nombres de archivo con un código de documento y otra lista de pospuestos en su sección 12.3. La instrucción de esta entrega pide </w:t>
             </w:r>
             <w:r>
               <w:rPr>
@@ -7956,6 +8578,474 @@
                 <w:sz w:val="19"/>
               </w:rPr>
               <w:t>Registro</w:t>
+            </w:r>
+          </w:p>
+        </w:tc>
+      </w:tr>
+      <w:tr>
+        <w:trPr>
+          <w:cantSplit/>
+        </w:trPr>
+        <w:tc>
+          <w:tcPr>
+            <w:tcW w:type="dxa" w:w="579"/>
+            <w:vAlign w:val="top"/>
+            <w:shd w:val="clear" w:color="auto" w:fill="F3F6FA"/>
+          </w:tcPr>
+          <w:p>
+            <w:pPr>
+              <w:pStyle w:val="Textodetabla"/>
+            </w:pPr>
+            <w:r>
+              <w:rPr>
+                <w:sz w:val="19"/>
+              </w:rPr>
+              <w:t>16</w:t>
+            </w:r>
+          </w:p>
+        </w:tc>
+        <w:tc>
+          <w:tcPr>
+            <w:tcW w:type="dxa" w:w="3979"/>
+            <w:vAlign w:val="top"/>
+            <w:shd w:val="clear" w:color="auto" w:fill="F3F6FA"/>
+          </w:tcPr>
+          <w:p>
+            <w:pPr>
+              <w:pStyle w:val="Textodetabla"/>
+            </w:pPr>
+            <w:r>
+              <w:rPr>
+                <w:sz w:val="19"/>
+              </w:rPr>
+              <w:t>El contexto lista las 15 reglas de sobre como «no ubicadas». El PR #8 (</w:t>
+            </w:r>
+            <w:r>
+              <w:rPr>
+                <w:rFonts w:ascii="Consolas" w:hAnsi="Consolas"/>
+                <w:sz w:val="16"/>
+                <w:shd w:val="clear" w:color="auto" w:fill="F2F2F2"/>
+              </w:rPr>
+              <w:t>feat/e1-reglas-sobre</w:t>
+            </w:r>
+            <w:r>
+              <w:rPr>
+                <w:sz w:val="19"/>
+              </w:rPr>
+              <w:t xml:space="preserve">, abierto el 14-10-2026) agrega 15 reglas (100101 a 100115) que etiquetan </w:t>
+            </w:r>
+            <w:r>
+              <w:rPr>
+                <w:rFonts w:ascii="Consolas" w:hAnsi="Consolas"/>
+                <w:sz w:val="16"/>
+                <w:shd w:val="clear" w:color="auto" w:fill="F2F2F2"/>
+              </w:rPr>
+              <w:t>kronos_f1</w:t>
+            </w:r>
+            <w:r>
+              <w:rPr>
+                <w:sz w:val="19"/>
+              </w:rPr>
+              <w:t xml:space="preserve"> a </w:t>
+            </w:r>
+            <w:r>
+              <w:rPr>
+                <w:rFonts w:ascii="Consolas" w:hAnsi="Consolas"/>
+                <w:sz w:val="16"/>
+                <w:shd w:val="clear" w:color="auto" w:fill="F2F2F2"/>
+              </w:rPr>
+              <w:t>kronos_f6</w:t>
+            </w:r>
+            <w:r>
+              <w:rPr>
+                <w:sz w:val="19"/>
+              </w:rPr>
+              <w:t>, y su descripción informa que están instaladas en SOAR-CORE-01</w:t>
+            </w:r>
+          </w:p>
+        </w:tc>
+        <w:tc>
+          <w:tcPr>
+            <w:tcW w:type="dxa" w:w="3328"/>
+            <w:vAlign w:val="top"/>
+            <w:shd w:val="clear" w:color="auto" w:fill="F3F6FA"/>
+          </w:tcPr>
+          <w:p>
+            <w:pPr>
+              <w:pStyle w:val="Textodetabla"/>
+            </w:pPr>
+            <w:r>
+              <w:rPr>
+                <w:rFonts w:ascii="Segoe UI Emoji" w:hAnsi="Segoe UI Emoji"/>
+                <w:sz w:val="19"/>
+              </w:rPr>
+              <w:t>🟡</w:t>
+            </w:r>
+            <w:r>
+              <w:rPr>
+                <w:sz w:val="19"/>
+              </w:rPr>
+              <w:t xml:space="preserve"> hasta revisar el PR #8</w:t>
+            </w:r>
+          </w:p>
+        </w:tc>
+        <w:tc>
+          <w:tcPr>
+            <w:tcW w:type="dxa" w:w="1519"/>
+            <w:vAlign w:val="top"/>
+            <w:shd w:val="clear" w:color="auto" w:fill="F3F6FA"/>
+          </w:tcPr>
+          <w:p>
+            <w:pPr>
+              <w:pStyle w:val="Textodetabla"/>
+            </w:pPr>
+            <w:r>
+              <w:rPr>
+                <w:sz w:val="19"/>
+              </w:rPr>
+              <w:t>Contexto y PR #8</w:t>
+            </w:r>
+          </w:p>
+        </w:tc>
+      </w:tr>
+      <w:tr>
+        <w:trPr>
+          <w:cantSplit/>
+        </w:trPr>
+        <w:tc>
+          <w:tcPr>
+            <w:tcW w:type="dxa" w:w="579"/>
+            <w:vAlign w:val="top"/>
+          </w:tcPr>
+          <w:p>
+            <w:pPr>
+              <w:pStyle w:val="Textodetabla"/>
+            </w:pPr>
+            <w:r>
+              <w:rPr>
+                <w:sz w:val="19"/>
+              </w:rPr>
+              <w:t>17</w:t>
+            </w:r>
+          </w:p>
+        </w:tc>
+        <w:tc>
+          <w:tcPr>
+            <w:tcW w:type="dxa" w:w="3979"/>
+            <w:vAlign w:val="top"/>
+          </w:tcPr>
+          <w:p>
+            <w:pPr>
+              <w:pStyle w:val="Textodetabla"/>
+            </w:pPr>
+            <w:r>
+              <w:rPr>
+                <w:sz w:val="19"/>
+              </w:rPr>
+              <w:t>El contexto marca R3 como verificada. En el repositorio no existe todavía un servicio que registre antes de ejecutar</w:t>
+            </w:r>
+          </w:p>
+        </w:tc>
+        <w:tc>
+          <w:tcPr>
+            <w:tcW w:type="dxa" w:w="3328"/>
+            <w:vAlign w:val="top"/>
+          </w:tcPr>
+          <w:p>
+            <w:pPr>
+              <w:pStyle w:val="Textodetabla"/>
+            </w:pPr>
+            <w:r>
+              <w:rPr>
+                <w:rFonts w:ascii="Segoe UI Emoji" w:hAnsi="Segoe UI Emoji"/>
+                <w:sz w:val="19"/>
+              </w:rPr>
+              <w:t>⏳</w:t>
+            </w:r>
+            <w:r>
+              <w:rPr>
+                <w:sz w:val="19"/>
+              </w:rPr>
+              <w:t xml:space="preserve"> servicio</w:t>
+            </w:r>
+          </w:p>
+        </w:tc>
+        <w:tc>
+          <w:tcPr>
+            <w:tcW w:type="dxa" w:w="1519"/>
+            <w:vAlign w:val="top"/>
+          </w:tcPr>
+          <w:p>
+            <w:pPr>
+              <w:pStyle w:val="Textodetabla"/>
+            </w:pPr>
+            <w:r>
+              <w:rPr>
+                <w:sz w:val="19"/>
+              </w:rPr>
+              <w:t>Contexto y repositorio</w:t>
+            </w:r>
+          </w:p>
+        </w:tc>
+      </w:tr>
+      <w:tr>
+        <w:trPr>
+          <w:cantSplit/>
+        </w:trPr>
+        <w:tc>
+          <w:tcPr>
+            <w:tcW w:type="dxa" w:w="579"/>
+            <w:vAlign w:val="top"/>
+            <w:shd w:val="clear" w:color="auto" w:fill="F3F6FA"/>
+          </w:tcPr>
+          <w:p>
+            <w:pPr>
+              <w:pStyle w:val="Textodetabla"/>
+            </w:pPr>
+            <w:r>
+              <w:rPr>
+                <w:sz w:val="19"/>
+              </w:rPr>
+              <w:t>18</w:t>
+            </w:r>
+          </w:p>
+        </w:tc>
+        <w:tc>
+          <w:tcPr>
+            <w:tcW w:type="dxa" w:w="3979"/>
+            <w:vAlign w:val="top"/>
+            <w:shd w:val="clear" w:color="auto" w:fill="F3F6FA"/>
+          </w:tcPr>
+          <w:p>
+            <w:pPr>
+              <w:pStyle w:val="Textodetabla"/>
+            </w:pPr>
+            <w:r>
+              <w:rPr>
+                <w:sz w:val="19"/>
+              </w:rPr>
+              <w:t>El contexto habla de seis categorías de exclusión y cinco contadores de tasa. El código no fija cantidades: recibe categorías y contadores como datos</w:t>
+            </w:r>
+          </w:p>
+        </w:tc>
+        <w:tc>
+          <w:tcPr>
+            <w:tcW w:type="dxa" w:w="3328"/>
+            <w:vAlign w:val="top"/>
+            <w:shd w:val="clear" w:color="auto" w:fill="F3F6FA"/>
+          </w:tcPr>
+          <w:p>
+            <w:pPr>
+              <w:pStyle w:val="Textodetabla"/>
+            </w:pPr>
+            <w:r>
+              <w:rPr>
+                <w:sz w:val="19"/>
+              </w:rPr>
+              <w:t>Se mantienen como por confirmar</w:t>
+            </w:r>
+          </w:p>
+        </w:tc>
+        <w:tc>
+          <w:tcPr>
+            <w:tcW w:type="dxa" w:w="1519"/>
+            <w:vAlign w:val="top"/>
+            <w:shd w:val="clear" w:color="auto" w:fill="F3F6FA"/>
+          </w:tcPr>
+          <w:p>
+            <w:pPr>
+              <w:pStyle w:val="Textodetabla"/>
+            </w:pPr>
+            <w:r>
+              <w:rPr>
+                <w:sz w:val="19"/>
+              </w:rPr>
+              <w:t>Contexto y repositorio</w:t>
+            </w:r>
+          </w:p>
+        </w:tc>
+      </w:tr>
+      <w:tr>
+        <w:trPr>
+          <w:cantSplit/>
+        </w:trPr>
+        <w:tc>
+          <w:tcPr>
+            <w:tcW w:type="dxa" w:w="579"/>
+            <w:vAlign w:val="top"/>
+          </w:tcPr>
+          <w:p>
+            <w:pPr>
+              <w:pStyle w:val="Textodetabla"/>
+            </w:pPr>
+            <w:r>
+              <w:rPr>
+                <w:sz w:val="19"/>
+              </w:rPr>
+              <w:t>19</w:t>
+            </w:r>
+          </w:p>
+        </w:tc>
+        <w:tc>
+          <w:tcPr>
+            <w:tcW w:type="dxa" w:w="3979"/>
+            <w:vAlign w:val="top"/>
+          </w:tcPr>
+          <w:p>
+            <w:pPr>
+              <w:pStyle w:val="Textodetabla"/>
+            </w:pPr>
+            <w:r>
+              <w:rPr>
+                <w:sz w:val="19"/>
+              </w:rPr>
+              <w:t>El contexto da como medida una precisión de punta a punta del orden de 64 %. No se puede reproducir con los CSV del repositorio, porque el paso 2 no tiene playbook esperado</w:t>
+            </w:r>
+          </w:p>
+        </w:tc>
+        <w:tc>
+          <w:tcPr>
+            <w:tcW w:type="dxa" w:w="3328"/>
+            <w:vAlign w:val="top"/>
+          </w:tcPr>
+          <w:p>
+            <w:pPr>
+              <w:pStyle w:val="Textodetabla"/>
+            </w:pPr>
+            <w:r>
+              <w:rPr>
+                <w:rFonts w:ascii="Segoe UI Emoji" w:hAnsi="Segoe UI Emoji"/>
+                <w:sz w:val="19"/>
+              </w:rPr>
+              <w:t>🟡</w:t>
+            </w:r>
+            <w:r>
+              <w:rPr>
+                <w:sz w:val="19"/>
+              </w:rPr>
+              <w:t>, citada al replanteamiento SaaS</w:t>
+            </w:r>
+          </w:p>
+        </w:tc>
+        <w:tc>
+          <w:tcPr>
+            <w:tcW w:type="dxa" w:w="1519"/>
+            <w:vAlign w:val="top"/>
+          </w:tcPr>
+          <w:p>
+            <w:pPr>
+              <w:pStyle w:val="Textodetabla"/>
+            </w:pPr>
+            <w:r>
+              <w:rPr>
+                <w:sz w:val="19"/>
+              </w:rPr>
+              <w:t>Contexto y repositorio</w:t>
+            </w:r>
+          </w:p>
+        </w:tc>
+      </w:tr>
+      <w:tr>
+        <w:trPr>
+          <w:cantSplit/>
+        </w:trPr>
+        <w:tc>
+          <w:tcPr>
+            <w:tcW w:type="dxa" w:w="579"/>
+            <w:vAlign w:val="top"/>
+            <w:shd w:val="clear" w:color="auto" w:fill="F3F6FA"/>
+          </w:tcPr>
+          <w:p>
+            <w:pPr>
+              <w:pStyle w:val="Textodetabla"/>
+            </w:pPr>
+            <w:r>
+              <w:rPr>
+                <w:sz w:val="19"/>
+              </w:rPr>
+              <w:t>20</w:t>
+            </w:r>
+          </w:p>
+        </w:tc>
+        <w:tc>
+          <w:tcPr>
+            <w:tcW w:type="dxa" w:w="3979"/>
+            <w:vAlign w:val="top"/>
+            <w:shd w:val="clear" w:color="auto" w:fill="F3F6FA"/>
+          </w:tcPr>
+          <w:p>
+            <w:pPr>
+              <w:pStyle w:val="Textodetabla"/>
+            </w:pPr>
+            <w:r>
+              <w:rPr>
+                <w:sz w:val="19"/>
+              </w:rPr>
+              <w:t xml:space="preserve">El contexto trata a </w:t>
+            </w:r>
+            <w:r>
+              <w:rPr>
+                <w:rFonts w:ascii="Consolas" w:hAnsi="Consolas"/>
+                <w:sz w:val="16"/>
+                <w:shd w:val="clear" w:color="auto" w:fill="F2F2F2"/>
+              </w:rPr>
+              <w:t>soarai2026</w:t>
+            </w:r>
+            <w:r>
+              <w:rPr>
+                <w:sz w:val="19"/>
+              </w:rPr>
+              <w:t xml:space="preserve"> como la organización. En GitHub es una cuenta de usuario compartida, que creó los PR #1 a #6 y fusionó los #1 a #3</w:t>
+            </w:r>
+          </w:p>
+        </w:tc>
+        <w:tc>
+          <w:tcPr>
+            <w:tcW w:type="dxa" w:w="3328"/>
+            <w:vAlign w:val="top"/>
+            <w:shd w:val="clear" w:color="auto" w:fill="F3F6FA"/>
+          </w:tcPr>
+          <w:p>
+            <w:pPr>
+              <w:pStyle w:val="Textodetabla"/>
+            </w:pPr>
+            <w:r>
+              <w:rPr>
+                <w:sz w:val="19"/>
+              </w:rPr>
+              <w:t>Se documenta como riesgo (</w:t>
+            </w:r>
+            <w:r>
+              <w:rPr>
+                <w:b/>
+                <w:color w:val="8A2B0E"/>
+                <w:sz w:val="19"/>
+              </w:rPr>
+              <w:t>«Propuesta»</w:t>
+            </w:r>
+            <w:r>
+              <w:rPr>
+                <w:sz w:val="19"/>
+              </w:rPr>
+              <w:t>)</w:t>
+            </w:r>
+          </w:p>
+        </w:tc>
+        <w:tc>
+          <w:tcPr>
+            <w:tcW w:type="dxa" w:w="1519"/>
+            <w:vAlign w:val="top"/>
+            <w:shd w:val="clear" w:color="auto" w:fill="F3F6FA"/>
+          </w:tcPr>
+          <w:p>
+            <w:pPr>
+              <w:pStyle w:val="Textodetabla"/>
+            </w:pPr>
+            <w:r>
+              <w:rPr>
+                <w:sz w:val="19"/>
+              </w:rPr>
+              <w:t>Contexto y GitHub</w:t>
             </w:r>
           </w:p>
         </w:tc>

</xml_diff>